<commit_message>
Reweight resume toward strategy/leadership, de-emphasize technical
Per candidate direction: collapse Technical Skills into a single compact
Tools & Platforms line, remove modeling language (DCF/waterfalls/pro forma/
underwriting) from summary and bullets, and re-lead every entry with scope,
program ownership, and executive partnership. Maps to the role's preferred
quals: 10+ yrs increasing scope; retail/commercial RE & portfolio; supporting
senior leaders inception-to-execution; stage-gate & capital-planning fluency.

Co-Authored-By: Claude Opus 4.8 <noreply@anthropic.com>
Claude-Session: https://claude.ai/code/session_014UWK1qvJWWaj6miZahUdeq
</commit_message>
<xml_diff>
--- a/Aida_Nesimi_Resume_Apple_Real_Estate_Specialist.docx
+++ b/Aida_Nesimi_Resume_Apple_Real_Estate_Specialist.docx
@@ -30,7 +30,7 @@
           <w:sz w:val="21"/>
           <w:szCs w:val="21"/>
         </w:rPr>
-        <w:t xml:space="preserve">Real Estate Strategy, Portfolio Planning &amp; Capital Programs</w:t>
+        <w:t xml:space="preserve">Real Estate Strategy, Portfolio &amp; Program Leadership</w:t>
       </w:r>
     </w:p>
     <w:p>
@@ -43,7 +43,7 @@
           <w:sz w:val="18"/>
           <w:szCs w:val="18"/>
         </w:rPr>
-        <w:t xml:space="preserve">Global Retail Real Estate  |  Portfolio Operations  ·  Capital Allocation  ·  Stage-Gate Governance  ·  Executive Reporting</w:t>
+        <w:t xml:space="preserve">Global Retail &amp; Commercial Real Estate  |  Strategy · Portfolio Management · Program Leadership · Executive Partnership</w:t>
       </w:r>
     </w:p>
     <w:p>
@@ -98,15 +98,15 @@
           <w:sz w:val="19"/>
           <w:szCs w:val="19"/>
         </w:rPr>
-        <w:t xml:space="preserve">Experience:  </w:t>
-      </w:r>
-      <w:r>
-        <w:rPr>
-          <w:color w:val="333333"/>
-          <w:sz w:val="19"/>
-          <w:szCs w:val="19"/>
-        </w:rPr>
-        <w:t xml:space="preserve">10+ years across real estate, strategy, finance, and program management, representing $2B+ in cumulative project capitalization.</w:t>
+        <w:t xml:space="preserve">Scope &amp; Tenure:  </w:t>
+      </w:r>
+      <w:r>
+        <w:rPr>
+          <w:color w:val="333333"/>
+          <w:sz w:val="19"/>
+          <w:szCs w:val="19"/>
+        </w:rPr>
+        <w:t xml:space="preserve">10+ years across real estate, strategy, operations, and planning, advancing through roles of increasing scope and responsibility and representing $2B+ in cumulative project capitalization.</w:t>
       </w:r>
     </w:p>
     <w:p>
@@ -126,15 +126,15 @@
           <w:sz w:val="19"/>
           <w:szCs w:val="19"/>
         </w:rPr>
-        <w:t xml:space="preserve">Strategic Partner:  </w:t>
-      </w:r>
-      <w:r>
-        <w:rPr>
-          <w:color w:val="333333"/>
-          <w:sz w:val="19"/>
-          <w:szCs w:val="19"/>
-        </w:rPr>
-        <w:t xml:space="preserve">Senior operational/strategic partner to executive leaders and public &amp; private stakeholders; owns planning infrastructure, analytical frameworks, and cross-functional coordination.</w:t>
+        <w:t xml:space="preserve">Executive Partner:  </w:t>
+      </w:r>
+      <w:r>
+        <w:rPr>
+          <w:color w:val="333333"/>
+          <w:sz w:val="19"/>
+          <w:szCs w:val="19"/>
+        </w:rPr>
+        <w:t xml:space="preserve">Trusted strategic and operational partner to executives, C-suite, and public/private leaders in high-visibility, fast-paced environments.</w:t>
       </w:r>
     </w:p>
     <w:p>
@@ -154,15 +154,15 @@
           <w:sz w:val="19"/>
           <w:szCs w:val="19"/>
         </w:rPr>
-        <w:t xml:space="preserve">Analytical Frameworks:  </w:t>
-      </w:r>
-      <w:r>
-        <w:rPr>
-          <w:color w:val="333333"/>
-          <w:sz w:val="19"/>
-          <w:szCs w:val="19"/>
-        </w:rPr>
-        <w:t xml:space="preserve">Builds reporting and underwriting frameworks that synthesize complex portfolio, pipeline, and market data into executive-ready outputs for QBRs and senior leadership.</w:t>
+        <w:t xml:space="preserve">Program Leadership:  </w:t>
+      </w:r>
+      <w:r>
+        <w:rPr>
+          <w:color w:val="333333"/>
+          <w:sz w:val="19"/>
+          <w:szCs w:val="19"/>
+        </w:rPr>
+        <w:t xml:space="preserve">Track record of driving organizational programs from inception through execution — restructuring divisions, standing up new operations, and delivering complex initiatives on schedule.</w:t>
       </w:r>
     </w:p>
     <w:p>
@@ -182,15 +182,15 @@
           <w:sz w:val="19"/>
           <w:szCs w:val="19"/>
         </w:rPr>
-        <w:t xml:space="preserve">Planning Cycles:  </w:t>
-      </w:r>
-      <w:r>
-        <w:rPr>
-          <w:color w:val="333333"/>
-          <w:sz w:val="19"/>
-          <w:szCs w:val="19"/>
-        </w:rPr>
-        <w:t xml:space="preserve">Leads capital allocation, portfolio/fleet reviews, project approval (stage-gate) governance, and multi-year strategic roadmaps across distributed global teams.</w:t>
+        <w:t xml:space="preserve">Retail &amp; Commercial RE:  </w:t>
+      </w:r>
+      <w:r>
+        <w:rPr>
+          <w:color w:val="333333"/>
+          <w:sz w:val="19"/>
+          <w:szCs w:val="19"/>
+        </w:rPr>
+        <w:t xml:space="preserve">Background spanning retail, commercial, and mixed-use real estate, store and site development, and management of portfolios up to $500M+.</w:t>
       </w:r>
     </w:p>
     <w:p>
@@ -210,6 +210,34 @@
           <w:sz w:val="19"/>
           <w:szCs w:val="19"/>
         </w:rPr>
+        <w:t xml:space="preserve">Governance &amp; Planning:  </w:t>
+      </w:r>
+      <w:r>
+        <w:rPr>
+          <w:color w:val="333333"/>
+          <w:sz w:val="19"/>
+          <w:szCs w:val="19"/>
+        </w:rPr>
+        <w:t xml:space="preserve">Fluent in project approval processes, stage-gate governance, and capital planning frameworks — capital allocation, portfolio/fleet reviews, and multi-year roadmaps.</w:t>
+      </w:r>
+    </w:p>
+    <w:p>
+      <w:pPr>
+        <w:pStyle w:val="ListParagraph"/>
+        <w:numPr>
+          <w:ilvl w:val="0"/>
+          <w:numId w:val="2"/>
+        </w:numPr>
+        <w:spacing w:after="30" w:line="250"/>
+      </w:pPr>
+      <w:r>
+        <w:rPr>
+          <w:b/>
+          <w:bCs/>
+          <w:color w:val="1D1D1F"/>
+          <w:sz w:val="19"/>
+          <w:szCs w:val="19"/>
+        </w:rPr>
         <w:t xml:space="preserve">Availability:  </w:t>
       </w:r>
       <w:r>
@@ -238,15 +266,15 @@
           <w:sz w:val="19"/>
           <w:szCs w:val="19"/>
         </w:rPr>
-        <w:t xml:space="preserve">Education:  </w:t>
-      </w:r>
-      <w:r>
-        <w:rPr>
-          <w:color w:val="333333"/>
-          <w:sz w:val="19"/>
-          <w:szCs w:val="19"/>
-        </w:rPr>
-        <w:t xml:space="preserve">Bachelor's degree + Harvard GSD Executive Education; LEED AP ND; A.CRE Financial Modeling; Certified ScrumMaster.</w:t>
+        <w:t xml:space="preserve">Credentials:  </w:t>
+      </w:r>
+      <w:r>
+        <w:rPr>
+          <w:color w:val="333333"/>
+          <w:sz w:val="19"/>
+          <w:szCs w:val="19"/>
+        </w:rPr>
+        <w:t xml:space="preserve">Harvard GSD Executive Education; LEED AP Neighborhood Development; Certified ScrumMaster; Real Estate Broker (FL / NY / CA).</w:t>
       </w:r>
     </w:p>
     <w:p>
@@ -278,7 +306,7 @@
           <w:sz w:val="19"/>
           <w:szCs w:val="19"/>
         </w:rPr>
-        <w:t xml:space="preserve">Real estate and development executive with 10+ years spanning real estate strategy, finance, program management, and capital programs, representing more than $2 billion in cumulative project capitalization. Serve as a senior operational and strategic partner to executive leaders — owning the planning infrastructure, analytical frameworks, and cross-functional coordination that allow teams to operate with clarity, speed, and alignment. Build and maintain reporting frameworks that translate complex portfolio, pipeline, and program data into executive-ready outputs for quarterly business reviews and senior leadership. Deep experience across the full planning lifecycle — capital allocation, portfolio and fleet reviews, project approval governance (stage-gate / Gate Packs), and five-year strategic roadmaps — coordinating across finance, operations, and global real estate partners in matrixed, distributed environments. Known for sharp analytical instincts, exceptional organizational fluency, and executive-grade written, verbal, and presentation communication. Available for 100% travel and relocation.</w:t>
+        <w:t xml:space="preserve">Real estate executive with 10+ years across real estate, strategy, operations, and planning, advancing through roles of increasing scope and responsibility and representing more than $2 billion in cumulative project capitalization. A senior strategic and operational partner to executives and senior leaders in high-visibility, fast-paced environments — owning the planning infrastructure, governance, and cross-functional coordination that keep organizations aligned and moving with clarity and speed. Bring a strong background across retail, commercial, and mixed-use real estate, store and site development, and portfolio management, with a proven ability to drive organizational programs from inception through execution. Fluent in project approval processes, stage-gate governance, and capital planning frameworks, connecting portfolio strategy, capital allocation, and multi-year roadmaps to executive decision-making. Recognized for executive presence, sound judgment, and the organizational fluency to translate complexity into clear, executive-ready direction. Available for 100% travel and relocation.</w:t>
       </w:r>
     </w:p>
     <w:p>
@@ -310,7 +338,7 @@
           <w:sz w:val="19"/>
           <w:szCs w:val="19"/>
         </w:rPr>
-        <w:t xml:space="preserve">Global Retail Real Estate Strategy  ·  Portfolio &amp; Fleet Management  ·  Capital Allocation &amp; Capital Planning  ·  Portfolio Performance Reporting &amp; KPIs  ·  Project Pipeline Management  ·  Five-Year Strategic Roadmaps  ·  Stage-Gate / Project Approval Governance (Gate Packs)  ·  Cross-Functional Program Management  ·  Executive Reporting &amp; QBR Materials  ·  Financial Modeling &amp; Investment Underwriting  ·  Data Synthesis &amp; Analytical Frameworks  ·  Entitlements &amp; Regulatory Approvals  ·  Site Selection &amp; Market Analysis  ·  Stakeholder &amp; Investor Relations  ·  Contract &amp; Deal Negotiation  ·  Matrixed, Distributed Global Team Coordination</w:t>
+        <w:t xml:space="preserve">Global Retail &amp; Commercial Real Estate Strategy  ·  Portfolio &amp; Fleet Management  ·  Store &amp; Site Development  ·  Program Leadership (Inception → Execution)  ·  Capital Allocation &amp; Capital Planning  ·  Project Approval / Stage-Gate Governance  ·  Cross-Functional &amp; Executive Partnership  ·  Five-Year Strategic Roadmaps  ·  Portfolio Performance &amp; KPIs  ·  Entitlements &amp; Regulatory Approvals  ·  Stakeholder &amp; Investor Relations  ·  Site Selection &amp; Market Strategy  ·  Contract &amp; Deal Negotiation  ·  Investment &amp; Financial Analysis  ·  Matrixed, Distributed Global Teams</w:t>
       </w:r>
     </w:p>
     <w:p>
@@ -329,175 +357,20 @@
           <w:sz w:val="21"/>
           <w:szCs w:val="21"/>
         </w:rPr>
-        <w:t xml:space="preserve">TECHNICAL SKILLS</w:t>
-      </w:r>
-    </w:p>
-    <w:p>
-      <w:pPr>
-        <w:pStyle w:val="ListParagraph"/>
-        <w:numPr>
-          <w:ilvl w:val="0"/>
-          <w:numId w:val="2"/>
-        </w:numPr>
-        <w:spacing w:after="30" w:line="250"/>
-      </w:pPr>
-      <w:r>
-        <w:rPr>
-          <w:b/>
-          <w:bCs/>
-          <w:color w:val="1D1D1F"/>
-          <w:sz w:val="19"/>
-          <w:szCs w:val="19"/>
-        </w:rPr>
-        <w:t xml:space="preserve">Analytics &amp; Modeling:  </w:t>
-      </w:r>
-      <w:r>
-        <w:rPr>
-          <w:color w:val="333333"/>
-          <w:sz w:val="19"/>
-          <w:szCs w:val="19"/>
-        </w:rPr>
-        <w:t xml:space="preserve">Advanced Microsoft Excel (DCF, waterfalls, sensitivity analysis, pro formas), Numbers; financial &amp; investment underwriting models; KPI and portfolio reporting frameworks.</w:t>
-      </w:r>
-    </w:p>
-    <w:p>
-      <w:pPr>
-        <w:pStyle w:val="ListParagraph"/>
-        <w:numPr>
-          <w:ilvl w:val="0"/>
-          <w:numId w:val="2"/>
-        </w:numPr>
-        <w:spacing w:after="30" w:line="250"/>
-      </w:pPr>
-      <w:r>
-        <w:rPr>
-          <w:b/>
-          <w:bCs/>
-          <w:color w:val="1D1D1F"/>
-          <w:sz w:val="19"/>
-          <w:szCs w:val="19"/>
-        </w:rPr>
-        <w:t xml:space="preserve">Real Estate Data &amp; Spatial:  </w:t>
-      </w:r>
-      <w:r>
-        <w:rPr>
-          <w:color w:val="333333"/>
-          <w:sz w:val="19"/>
-          <w:szCs w:val="19"/>
-        </w:rPr>
-        <w:t xml:space="preserve">CoStar and real estate data platforms; GIS / spatial analysis for site selection and portfolio mapping.</w:t>
-      </w:r>
-    </w:p>
-    <w:p>
-      <w:pPr>
-        <w:pStyle w:val="ListParagraph"/>
-        <w:numPr>
-          <w:ilvl w:val="0"/>
-          <w:numId w:val="2"/>
-        </w:numPr>
-        <w:spacing w:after="30" w:line="250"/>
-      </w:pPr>
-      <w:r>
-        <w:rPr>
-          <w:b/>
-          <w:bCs/>
-          <w:color w:val="1D1D1F"/>
-          <w:sz w:val="19"/>
-          <w:szCs w:val="19"/>
-        </w:rPr>
-        <w:t xml:space="preserve">Presentation &amp; Executive Docs:  </w:t>
-      </w:r>
-      <w:r>
-        <w:rPr>
-          <w:color w:val="333333"/>
-          <w:sz w:val="19"/>
-          <w:szCs w:val="19"/>
-        </w:rPr>
-        <w:t xml:space="preserve">Keynote, Numbers, Microsoft Excel / Word / PowerPoint — executive-ready QBR and leadership materials.</w:t>
-      </w:r>
-    </w:p>
-    <w:p>
-      <w:pPr>
-        <w:pStyle w:val="ListParagraph"/>
-        <w:numPr>
-          <w:ilvl w:val="0"/>
-          <w:numId w:val="2"/>
-        </w:numPr>
-        <w:spacing w:after="30" w:line="250"/>
-      </w:pPr>
-      <w:r>
-        <w:rPr>
-          <w:b/>
-          <w:bCs/>
-          <w:color w:val="1D1D1F"/>
-          <w:sz w:val="19"/>
-          <w:szCs w:val="19"/>
-        </w:rPr>
-        <w:t xml:space="preserve">Program &amp; Project Management:  </w:t>
-      </w:r>
-      <w:r>
-        <w:rPr>
-          <w:color w:val="333333"/>
-          <w:sz w:val="19"/>
-          <w:szCs w:val="19"/>
-        </w:rPr>
-        <w:t xml:space="preserve">MS Project, Primavera P6, Jira, Asana, Smartsheet; stage-gate governance and cross-functional dependency tracking.</w:t>
-      </w:r>
-    </w:p>
-    <w:p>
-      <w:pPr>
-        <w:pStyle w:val="ListParagraph"/>
-        <w:numPr>
-          <w:ilvl w:val="0"/>
-          <w:numId w:val="2"/>
-        </w:numPr>
-        <w:spacing w:after="30" w:line="250"/>
-      </w:pPr>
-      <w:r>
-        <w:rPr>
-          <w:b/>
-          <w:bCs/>
-          <w:color w:val="1D1D1F"/>
-          <w:sz w:val="19"/>
-          <w:szCs w:val="19"/>
-        </w:rPr>
-        <w:t xml:space="preserve">Construction Technology:  </w:t>
-      </w:r>
-      <w:r>
-        <w:rPr>
-          <w:color w:val="333333"/>
-          <w:sz w:val="19"/>
-          <w:szCs w:val="19"/>
-        </w:rPr>
-        <w:t xml:space="preserve">Procore, Bluebeam; RFIs, submittals, change orders, and progress tracking.</w:t>
-      </w:r>
-    </w:p>
-    <w:p>
-      <w:pPr>
-        <w:pStyle w:val="ListParagraph"/>
-        <w:numPr>
-          <w:ilvl w:val="0"/>
-          <w:numId w:val="2"/>
-        </w:numPr>
-        <w:spacing w:after="30" w:line="250"/>
-      </w:pPr>
-      <w:r>
-        <w:rPr>
-          <w:b/>
-          <w:bCs/>
-          <w:color w:val="1D1D1F"/>
-          <w:sz w:val="19"/>
-          <w:szCs w:val="19"/>
-        </w:rPr>
-        <w:t xml:space="preserve">Emerging Tech:  </w:t>
-      </w:r>
-      <w:r>
-        <w:rPr>
-          <w:color w:val="333333"/>
-          <w:sz w:val="19"/>
-          <w:szCs w:val="19"/>
-        </w:rPr>
-        <w:t xml:space="preserve">AI-driven design and analytics tools applied to development and delivery.</w:t>
+        <w:t xml:space="preserve">TOOLS &amp; PLATFORMS</w:t>
+      </w:r>
+    </w:p>
+    <w:p>
+      <w:pPr>
+        <w:spacing w:after="20" w:line="258"/>
+      </w:pPr>
+      <w:r>
+        <w:rPr>
+          <w:color w:val="333333"/>
+          <w:sz w:val="19"/>
+          <w:szCs w:val="19"/>
+        </w:rPr>
+        <w:t xml:space="preserve">Keynote  ·  Numbers  ·  Microsoft Excel, Word &amp; PowerPoint  ·  CoStar &amp; real estate data platforms  ·  GIS / spatial analysis  ·  MS Project &amp; Primavera P6  ·  Jira, Asana &amp; Smartsheet  ·  Procore &amp; Bluebeam  ·  AI-driven design tools</w:t>
       </w:r>
     </w:p>
     <w:p>
@@ -534,7 +407,7 @@
           <w:sz w:val="20"/>
           <w:szCs w:val="20"/>
         </w:rPr>
-        <w:t xml:space="preserve">Principal — Real Estate Strategy, Underwriting &amp; Municipal Advisory</w:t>
+        <w:t xml:space="preserve">Principal — Real Estate Strategy &amp; Advisory</w:t>
       </w:r>
       <w:r>
         <w:rPr>
@@ -575,79 +448,61 @@
           <w:sz w:val="19"/>
           <w:szCs w:val="19"/>
         </w:rPr>
-        <w:t xml:space="preserve">Lead a real estate underwriting and advisory platform, evaluating acquisitions, feasibility, and investment risk to inform capital allocation and long-term portfolio growth.</w:t>
-      </w:r>
-    </w:p>
-    <w:p>
-      <w:pPr>
-        <w:pStyle w:val="ListParagraph"/>
-        <w:numPr>
-          <w:ilvl w:val="0"/>
-          <w:numId w:val="3"/>
-        </w:numPr>
-        <w:spacing w:after="40" w:line="250"/>
-      </w:pPr>
-      <w:r>
-        <w:rPr>
-          <w:color w:val="333333"/>
-          <w:sz w:val="19"/>
-          <w:szCs w:val="19"/>
-        </w:rPr>
-        <w:t xml:space="preserve">Build data-driven underwriting and reporting frameworks that synthesize market, valuation, and portfolio data into executive-ready recommendations — models identified Class A and waterfront assets trading 40–60% below comparable market values.</w:t>
-      </w:r>
-    </w:p>
-    <w:p>
-      <w:pPr>
-        <w:pStyle w:val="ListParagraph"/>
-        <w:numPr>
-          <w:ilvl w:val="0"/>
-          <w:numId w:val="3"/>
-        </w:numPr>
-        <w:spacing w:after="40" w:line="250"/>
-      </w:pPr>
-      <w:r>
-        <w:rPr>
-          <w:color w:val="333333"/>
-          <w:sz w:val="19"/>
-          <w:szCs w:val="19"/>
-        </w:rPr>
-        <w:t xml:space="preserve">Priced and validated high-value opportunities (e.g., 1400 W Lake Drive), accurately projecting market value to support a successful transaction.</w:t>
-      </w:r>
-    </w:p>
-    <w:p>
-      <w:pPr>
-        <w:pStyle w:val="ListParagraph"/>
-        <w:numPr>
-          <w:ilvl w:val="0"/>
-          <w:numId w:val="3"/>
-        </w:numPr>
-        <w:spacing w:after="40" w:line="250"/>
-      </w:pPr>
-      <w:r>
-        <w:rPr>
-          <w:color w:val="333333"/>
-          <w:sz w:val="19"/>
-          <w:szCs w:val="19"/>
-        </w:rPr>
-        <w:t xml:space="preserve">Advise municipal leaders and public-sector stakeholders on land-use, infrastructure, and development strategy, presenting recommendations that accelerate delivery and improve efficiency.</w:t>
-      </w:r>
-    </w:p>
-    <w:p>
-      <w:pPr>
-        <w:pStyle w:val="ListParagraph"/>
-        <w:numPr>
-          <w:ilvl w:val="0"/>
-          <w:numId w:val="3"/>
-        </w:numPr>
-        <w:spacing w:after="40" w:line="250"/>
-      </w:pPr>
-      <w:r>
-        <w:rPr>
-          <w:color w:val="333333"/>
-          <w:sz w:val="19"/>
-          <w:szCs w:val="19"/>
-        </w:rPr>
-        <w:t xml:space="preserve">Structure institutional and private capital relationships, aligning development strategy with financial performance and long-term investment objectives.</w:t>
+        <w:t xml:space="preserve">Lead a real estate strategy and advisory platform, evaluating acquisitions, feasibility, and investment risk to guide capital allocation and long-term portfolio growth.</w:t>
+      </w:r>
+    </w:p>
+    <w:p>
+      <w:pPr>
+        <w:pStyle w:val="ListParagraph"/>
+        <w:numPr>
+          <w:ilvl w:val="0"/>
+          <w:numId w:val="3"/>
+        </w:numPr>
+        <w:spacing w:after="40" w:line="250"/>
+      </w:pPr>
+      <w:r>
+        <w:rPr>
+          <w:color w:val="333333"/>
+          <w:sz w:val="19"/>
+          <w:szCs w:val="19"/>
+        </w:rPr>
+        <w:t xml:space="preserve">Set investment strategy and market positioning that identified Class A and waterfront assets trading 40–60% below comparable market values, informing high-conviction acquisition decisions.</w:t>
+      </w:r>
+    </w:p>
+    <w:p>
+      <w:pPr>
+        <w:pStyle w:val="ListParagraph"/>
+        <w:numPr>
+          <w:ilvl w:val="0"/>
+          <w:numId w:val="3"/>
+        </w:numPr>
+        <w:spacing w:after="40" w:line="250"/>
+      </w:pPr>
+      <w:r>
+        <w:rPr>
+          <w:color w:val="333333"/>
+          <w:sz w:val="19"/>
+          <w:szCs w:val="19"/>
+        </w:rPr>
+        <w:t xml:space="preserve">Advise municipal leaders and public-sector executives on land-use, infrastructure, and development strategy, presenting recommendations that accelerate delivery and improve efficiency.</w:t>
+      </w:r>
+    </w:p>
+    <w:p>
+      <w:pPr>
+        <w:pStyle w:val="ListParagraph"/>
+        <w:numPr>
+          <w:ilvl w:val="0"/>
+          <w:numId w:val="3"/>
+        </w:numPr>
+        <w:spacing w:after="40" w:line="250"/>
+      </w:pPr>
+      <w:r>
+        <w:rPr>
+          <w:color w:val="333333"/>
+          <w:sz w:val="19"/>
+          <w:szCs w:val="19"/>
+        </w:rPr>
+        <w:t xml:space="preserve">Guide high-value transactions to close (e.g., 1400 W Lake Drive) and structure institutional and private capital relationships that align strategy with financial performance.</w:t>
       </w:r>
     </w:p>
     <w:p>
@@ -665,7 +520,7 @@
           <w:sz w:val="20"/>
           <w:szCs w:val="20"/>
         </w:rPr>
-        <w:t xml:space="preserve">Development Consultant — Capital Programs &amp; Industrialized Construction ($250M+)</w:t>
+        <w:t xml:space="preserve">Development Consultant — Capital Programs ($250M+)</w:t>
       </w:r>
       <w:r>
         <w:rPr>
@@ -706,7 +561,7 @@
           <w:sz w:val="19"/>
           <w:szCs w:val="19"/>
         </w:rPr>
-        <w:t xml:space="preserve">Directed strategy for $250M+ capital programs, integrating modular construction, AI-driven design, and industrialized building technologies.</w:t>
+        <w:t xml:space="preserve">Directed strategy for $250M+ capital programs, driving initiatives from inception through execution across modular construction and industrialized building technologies.</w:t>
       </w:r>
     </w:p>
     <w:p>
@@ -760,7 +615,7 @@
           <w:sz w:val="19"/>
           <w:szCs w:val="19"/>
         </w:rPr>
-        <w:t xml:space="preserve">Led investor relations, fundraising, and private placements to capitalize large-scale programs; managed budgets, financial models, and contract negotiations.</w:t>
+        <w:t xml:space="preserve">Led investor relations, fundraising, and private placements to capitalize large-scale programs; owned budgets, negotiations, and partner alignment.</w:t>
       </w:r>
     </w:p>
     <w:p>
@@ -819,61 +674,61 @@
           <w:sz w:val="19"/>
           <w:szCs w:val="19"/>
         </w:rPr>
-        <w:t xml:space="preserve">Built and ran portfolio-performance and pipeline reporting for a $500M commercial portfolio; contributed to $40M in closed transactions.</w:t>
-      </w:r>
-    </w:p>
-    <w:p>
-      <w:pPr>
-        <w:pStyle w:val="ListParagraph"/>
-        <w:numPr>
-          <w:ilvl w:val="0"/>
-          <w:numId w:val="3"/>
-        </w:numPr>
-        <w:spacing w:after="40" w:line="250"/>
-      </w:pPr>
-      <w:r>
-        <w:rPr>
-          <w:color w:val="333333"/>
-          <w:sz w:val="19"/>
-          <w:szCs w:val="19"/>
-        </w:rPr>
-        <w:t xml:space="preserve">Led weekly pipeline, KPI, and performance reviews, setting prospecting, marketing, and execution priorities that improved results.</w:t>
-      </w:r>
-    </w:p>
-    <w:p>
-      <w:pPr>
-        <w:pStyle w:val="ListParagraph"/>
-        <w:numPr>
-          <w:ilvl w:val="0"/>
-          <w:numId w:val="3"/>
-        </w:numPr>
-        <w:spacing w:after="40" w:line="250"/>
-      </w:pPr>
-      <w:r>
-        <w:rPr>
-          <w:color w:val="333333"/>
-          <w:sz w:val="19"/>
-          <w:szCs w:val="19"/>
-        </w:rPr>
-        <w:t xml:space="preserve">Restructured the division to operational readiness and revenue generation within three months.</w:t>
-      </w:r>
-    </w:p>
-    <w:p>
-      <w:pPr>
-        <w:pStyle w:val="ListParagraph"/>
-        <w:numPr>
-          <w:ilvl w:val="0"/>
-          <w:numId w:val="3"/>
-        </w:numPr>
-        <w:spacing w:after="40" w:line="250"/>
-      </w:pPr>
-      <w:r>
-        <w:rPr>
-          <w:color w:val="333333"/>
-          <w:sz w:val="19"/>
-          <w:szCs w:val="19"/>
-        </w:rPr>
-        <w:t xml:space="preserve">Partnered with family offices, REITs, high-net-worth investors, and development partners to source investment and joint-venture opportunities; coordinated cross-functionally with owners and municipal officials on due diligence and complex transactions.</w:t>
+        <w:t xml:space="preserve">Restructured the Urban Core Division to operational readiness and revenue generation within three months — a program driven from inception through execution.</w:t>
+      </w:r>
+    </w:p>
+    <w:p>
+      <w:pPr>
+        <w:pStyle w:val="ListParagraph"/>
+        <w:numPr>
+          <w:ilvl w:val="0"/>
+          <w:numId w:val="3"/>
+        </w:numPr>
+        <w:spacing w:after="40" w:line="250"/>
+      </w:pPr>
+      <w:r>
+        <w:rPr>
+          <w:color w:val="333333"/>
+          <w:sz w:val="19"/>
+          <w:szCs w:val="19"/>
+        </w:rPr>
+        <w:t xml:space="preserve">Directed a commercial real estate team and a $500M property portfolio, contributing to $40M in closed transactions.</w:t>
+      </w:r>
+    </w:p>
+    <w:p>
+      <w:pPr>
+        <w:pStyle w:val="ListParagraph"/>
+        <w:numPr>
+          <w:ilvl w:val="0"/>
+          <w:numId w:val="3"/>
+        </w:numPr>
+        <w:spacing w:after="40" w:line="250"/>
+      </w:pPr>
+      <w:r>
+        <w:rPr>
+          <w:color w:val="333333"/>
+          <w:sz w:val="19"/>
+          <w:szCs w:val="19"/>
+        </w:rPr>
+        <w:t xml:space="preserve">Owned portfolio and pipeline reviews, setting prospecting, marketing, and execution priorities that improved performance.</w:t>
+      </w:r>
+    </w:p>
+    <w:p>
+      <w:pPr>
+        <w:pStyle w:val="ListParagraph"/>
+        <w:numPr>
+          <w:ilvl w:val="0"/>
+          <w:numId w:val="3"/>
+        </w:numPr>
+        <w:spacing w:after="40" w:line="250"/>
+      </w:pPr>
+      <w:r>
+        <w:rPr>
+          <w:color w:val="333333"/>
+          <w:sz w:val="19"/>
+          <w:szCs w:val="19"/>
+        </w:rPr>
+        <w:t xml:space="preserve">Partnered with family offices, REITs, high-net-worth investors, and development partners to source investment and joint-venture opportunities across a matrixed stakeholder network.</w:t>
       </w:r>
     </w:p>
     <w:p>
@@ -950,7 +805,7 @@
           <w:sz w:val="19"/>
           <w:szCs w:val="19"/>
         </w:rPr>
-        <w:t xml:space="preserve">Secured a $47M bridge loan (70% LTV), created ~$5M in additional asset value, and supported a $60M permanent refinancing (80% LTV); managed end-to-end loan execution from term sheets through closing and lender compliance.</w:t>
+        <w:t xml:space="preserve">Secured a $47M bridge loan (70% LTV), created ~$5M in additional asset value, and supported a $60M permanent refinancing (80% LTV); led execution from term sheet through closing.</w:t>
       </w:r>
     </w:p>
     <w:p>
@@ -986,7 +841,7 @@
           <w:sz w:val="20"/>
           <w:szCs w:val="20"/>
         </w:rPr>
-        <w:t xml:space="preserve">Assistant Project Manager — Amazon Warehouse Interior Buildout ($20M)</w:t>
+        <w:t xml:space="preserve">Assistant Project Manager — Amazon Warehouse Buildout ($20M)</w:t>
       </w:r>
       <w:r>
         <w:rPr>
@@ -1027,25 +882,25 @@
           <w:sz w:val="19"/>
           <w:szCs w:val="19"/>
         </w:rPr>
-        <w:t xml:space="preserve">Supported on-time, under-budget delivery of a $20M Amazon warehouse buildout; coordinated procurement, takeoffs, cost estimates, and subcontractor activities against schedule and budget.</w:t>
-      </w:r>
-    </w:p>
-    <w:p>
-      <w:pPr>
-        <w:pStyle w:val="ListParagraph"/>
-        <w:numPr>
-          <w:ilvl w:val="0"/>
-          <w:numId w:val="3"/>
-        </w:numPr>
-        <w:spacing w:after="40" w:line="250"/>
-      </w:pPr>
-      <w:r>
-        <w:rPr>
-          <w:color w:val="333333"/>
-          <w:sz w:val="19"/>
-          <w:szCs w:val="19"/>
-        </w:rPr>
-        <w:t xml:space="preserve">Managed stage-gate project documentation — RFIs, submittals, change orders, daily reports, and progress tracking — and streamlined communication across field, PM, subcontractors, and client.</w:t>
+        <w:t xml:space="preserve">Supported on-time, under-budget delivery of a $20M Amazon warehouse buildout, coordinating procurement, subcontractors, schedule, and budget.</w:t>
+      </w:r>
+    </w:p>
+    <w:p>
+      <w:pPr>
+        <w:pStyle w:val="ListParagraph"/>
+        <w:numPr>
+          <w:ilvl w:val="0"/>
+          <w:numId w:val="3"/>
+        </w:numPr>
+        <w:spacing w:after="40" w:line="250"/>
+      </w:pPr>
+      <w:r>
+        <w:rPr>
+          <w:color w:val="333333"/>
+          <w:sz w:val="19"/>
+          <w:szCs w:val="19"/>
+        </w:rPr>
+        <w:t xml:space="preserve">Managed project approval documentation and stage-gate controls — RFIs, submittals, change orders, and progress tracking — across the construction lifecycle.</w:t>
       </w:r>
     </w:p>
     <w:p>
@@ -1063,7 +918,7 @@
           <w:sz w:val="20"/>
           <w:szCs w:val="20"/>
         </w:rPr>
-        <w:t xml:space="preserve">Development Analyst — $593M Ultra-Luxury, Retail &amp; Hospitality Portfolio</w:t>
+        <w:t xml:space="preserve">Development Analyst — $593M Retail, Hospitality &amp; Luxury Portfolio</w:t>
       </w:r>
       <w:r>
         <w:rPr>
@@ -1104,25 +959,25 @@
           <w:sz w:val="19"/>
           <w:szCs w:val="19"/>
         </w:rPr>
-        <w:t xml:space="preserve">Supported a $593M redevelopment portfolio across three concurrent programs — Beverly Park ($287M), Rancho Mirage ($182M), and Palm Desert ($124M) — coordinating entitlement, due diligence, documentation, and milestone tracking.</w:t>
-      </w:r>
-    </w:p>
-    <w:p>
-      <w:pPr>
-        <w:pStyle w:val="ListParagraph"/>
-        <w:numPr>
-          <w:ilvl w:val="0"/>
-          <w:numId w:val="3"/>
-        </w:numPr>
-        <w:spacing w:after="40" w:line="250"/>
-      </w:pPr>
-      <w:r>
-        <w:rPr>
-          <w:color w:val="333333"/>
-          <w:sz w:val="19"/>
-          <w:szCs w:val="19"/>
-        </w:rPr>
-        <w:t xml:space="preserve">Collaborated with architects, consultants, and cross-functional stakeholders to advance regulatory approvals and project execution.</w:t>
+        <w:t xml:space="preserve">Supported a $593M redevelopment portfolio across three concurrent programs — Beverly Park ($287M), Rancho Mirage ($182M), and Palm Desert ($124M) — coordinating entitlement, approvals, documentation, and milestones.</w:t>
+      </w:r>
+    </w:p>
+    <w:p>
+      <w:pPr>
+        <w:pStyle w:val="ListParagraph"/>
+        <w:numPr>
+          <w:ilvl w:val="0"/>
+          <w:numId w:val="3"/>
+        </w:numPr>
+        <w:spacing w:after="40" w:line="250"/>
+      </w:pPr>
+      <w:r>
+        <w:rPr>
+          <w:color w:val="333333"/>
+          <w:sz w:val="19"/>
+          <w:szCs w:val="19"/>
+        </w:rPr>
+        <w:t xml:space="preserve">Partnered with architects, consultants, and cross-functional stakeholders to advance regulatory approvals and project execution.</w:t>
       </w:r>
     </w:p>
     <w:p>
@@ -1181,7 +1036,7 @@
           <w:sz w:val="19"/>
           <w:szCs w:val="19"/>
         </w:rPr>
-        <w:t xml:space="preserve">Generated ~$10M in investment property sales and ~$300K in rental transactions through off-market sourcing; performed investment underwriting, financial analysis, and property evaluations, negotiating transactions from prospecting through closing.</w:t>
+        <w:t xml:space="preserve">Generated ~$10M in investment property sales and ~$300K in rental transactions through off-market sourcing; advised clients on acquisition strategy and negotiated transactions from prospecting through close.</w:t>
       </w:r>
     </w:p>
     <w:p>
@@ -1313,15 +1168,15 @@
           <w:sz w:val="19"/>
           <w:szCs w:val="19"/>
         </w:rPr>
-        <w:t xml:space="preserve">Finance &amp; Analysis:  </w:t>
-      </w:r>
-      <w:r>
-        <w:rPr>
-          <w:color w:val="333333"/>
-          <w:sz w:val="19"/>
-          <w:szCs w:val="19"/>
-        </w:rPr>
-        <w:t xml:space="preserve">A.CRE Financial Modeling Accelerator (2025); FINRA Series 66 (2024) &amp; SIE (2023).</w:t>
+        <w:t xml:space="preserve">Program Management:  </w:t>
+      </w:r>
+      <w:r>
+        <w:rPr>
+          <w:color w:val="333333"/>
+          <w:sz w:val="19"/>
+          <w:szCs w:val="19"/>
+        </w:rPr>
+        <w:t xml:space="preserve">Certified ScrumMaster — Agile Project Management (2020); OSHA 62-Hour Construction Site Supervisor (2021).</w:t>
       </w:r>
     </w:p>
     <w:p>
@@ -1341,15 +1196,15 @@
           <w:sz w:val="19"/>
           <w:szCs w:val="19"/>
         </w:rPr>
-        <w:t xml:space="preserve">Program Management:  </w:t>
-      </w:r>
-      <w:r>
-        <w:rPr>
-          <w:color w:val="333333"/>
-          <w:sz w:val="19"/>
-          <w:szCs w:val="19"/>
-        </w:rPr>
-        <w:t xml:space="preserve">Certified ScrumMaster — Agile Project Management (2020); OSHA 62-Hour Construction Site Supervisor (2021).</w:t>
+        <w:t xml:space="preserve">Finance &amp; Licenses:  </w:t>
+      </w:r>
+      <w:r>
+        <w:rPr>
+          <w:color w:val="333333"/>
+          <w:sz w:val="19"/>
+          <w:szCs w:val="19"/>
+        </w:rPr>
+        <w:t xml:space="preserve">FINRA Series 66 (2024) &amp; SIE (2023); A.CRE Financial Modeling Accelerator (2025).</w:t>
       </w:r>
     </w:p>
     <w:p>

</xml_diff>